<commit_message>
Tracetabellen: nur Variablen, Markierung „// → Tabellenzeile“ im Code (Regel + Referenzbeispiel)
- Regel in CLAUDE.md, AUFGABENFORMAT, Werkzeugkarte (Kopiervorlage) und Gesamtübersicht
- Referenz: W0 AB2 Aufgabe 5 „Die Zauberfolge“ ohne Bedingungsspalte, Code markiert (AB + Lösung)
- Umsetzung in allen Welten folgt

Co-Authored-By: Claude Opus 5.5 <noreply@anthropic.com>
Claude-Session: https://claude.ai/code/session_01CemoEYGRdCe5FszEBVFFUP
</commit_message>
<xml_diff>
--- a/materialien/Welt0_Akademie/2_Arbeitsblaetter/AQ_W0_AB2_Werkstatt_Basics.docx
+++ b/materialien/Welt0_Akademie/2_Arbeitsblaetter/AQ_W0_AB2_Werkstatt_Basics.docx
@@ -12791,6 +12791,15 @@
               </w:rPr>
               <w:t xml:space="preserve">    int s = 0;</w:t>
             </w:r>
+            <w:r>
+              <w:rPr>
+                <w:rFonts w:ascii="Consolas" w:cs="Consolas" w:eastAsia="Consolas" w:hAnsi="Consolas"/>
+                <w:color w:val="5F7F5F"/>
+                <w:sz w:val="18"/>
+                <w:szCs w:val="18"/>
+              </w:rPr>
+              <w:t xml:space="preserve">   // → Tabellenzeile (Startwerte)</w:t>
+            </w:r>
           </w:p>
           <w:p>
             <w:pPr>
@@ -12965,6 +12974,15 @@
                 <w:szCs w:val="18"/>
               </w:rPr>
               <w:t xml:space="preserve">        s++;</w:t>
+            </w:r>
+            <w:r>
+              <w:rPr>
+                <w:rFonts w:ascii="Consolas" w:cs="Consolas" w:eastAsia="Consolas" w:hAnsi="Consolas"/>
+                <w:color w:val="5F7F5F"/>
+                <w:sz w:val="18"/>
+                <w:szCs w:val="18"/>
+              </w:rPr>
+              <w:t xml:space="preserve">   // → Tabellenzeile</w:t>
             </w:r>
           </w:p>
           <w:p>
@@ -13140,7 +13158,7 @@
                 <w:sz w:val="22"/>
                 <w:szCs w:val="22"/>
               </w:rPr>
-              <w:t xml:space="preserve">: erste Zeile vor der Schleife, dann eine Zeile am Ende jedes Durchlaufs. Gib den Rückgabewert an.</w:t>
+              <w:t xml:space="preserve">: eine Zeile an jeder mit „// → Tabellenzeile“ markierten Stelle (vor der Schleife und am Ende jedes Durchlaufs). Gib den Rückgabewert an.</w:t>
             </w:r>
           </w:p>
         </w:tc>
@@ -13194,10 +13212,9 @@
         <w:tblLayout w:type="fixed"/>
       </w:tblPr>
       <w:tblGrid>
-        <w:gridCol w:w="1735"/>
-        <w:gridCol w:w="2891"/>
-        <w:gridCol w:w="2506"/>
-        <w:gridCol w:w="2506"/>
+        <w:gridCol w:w="2478"/>
+        <w:gridCol w:w="3580"/>
+        <w:gridCol w:w="3580"/>
       </w:tblGrid>
       <w:tr>
         <w:trPr>
@@ -13206,7 +13223,7 @@
         </w:trPr>
         <w:tc>
           <w:tcPr>
-            <w:tcW w:type="dxa" w:w="1735"/>
+            <w:tcW w:type="dxa" w:w="2478"/>
             <w:shd w:fill="1F4E79" w:color="auto" w:val="clear"/>
             <w:tcMar>
               <w:top w:type="dxa" w:w="50"/>
@@ -13236,7 +13253,7 @@
         </w:tc>
         <w:tc>
           <w:tcPr>
-            <w:tcW w:type="dxa" w:w="2891"/>
+            <w:tcW w:type="dxa" w:w="3580"/>
             <w:shd w:fill="1F4E79" w:color="auto" w:val="clear"/>
             <w:tcMar>
               <w:top w:type="dxa" w:w="50"/>
@@ -13260,43 +13277,13 @@
                 <w:sz w:val="19"/>
                 <w:szCs w:val="19"/>
               </w:rPr>
-              <w:t xml:space="preserve">n % 2 == 0 (w/f)</w:t>
-            </w:r>
-          </w:p>
-        </w:tc>
-        <w:tc>
-          <w:tcPr>
-            <w:tcW w:type="dxa" w:w="2506"/>
-            <w:shd w:fill="1F4E79" w:color="auto" w:val="clear"/>
-            <w:tcMar>
-              <w:top w:type="dxa" w:w="50"/>
-              <w:left w:type="dxa" w:w="100"/>
-              <w:bottom w:type="dxa" w:w="50"/>
-              <w:right w:type="dxa" w:w="100"/>
-            </w:tcMar>
-            <w:vAlign w:val="center"/>
-          </w:tcPr>
-          <w:p>
-            <w:pPr>
-              <w:spacing w:after="0" w:line="252"/>
-              <w:jc w:val="center"/>
-            </w:pPr>
-            <w:r>
-              <w:rPr>
-                <w:rFonts w:ascii="Calibri" w:cs="Calibri" w:eastAsia="Calibri" w:hAnsi="Calibri"/>
-                <w:b/>
-                <w:bCs/>
-                <w:color w:val="FFFFFF"/>
-                <w:sz w:val="19"/>
-                <w:szCs w:val="19"/>
-              </w:rPr>
               <w:t xml:space="preserve">n</w:t>
             </w:r>
           </w:p>
         </w:tc>
         <w:tc>
           <w:tcPr>
-            <w:tcW w:type="dxa" w:w="2506"/>
+            <w:tcW w:type="dxa" w:w="3580"/>
             <w:shd w:fill="1F4E79" w:color="auto" w:val="clear"/>
             <w:tcMar>
               <w:top w:type="dxa" w:w="50"/>
@@ -13332,7 +13319,7 @@
         </w:trPr>
         <w:tc>
           <w:tcPr>
-            <w:tcW w:type="dxa" w:w="1735"/>
+            <w:tcW w:type="dxa" w:w="2478"/>
             <w:tcMar>
               <w:top w:type="dxa" w:w="50"/>
               <w:left w:type="dxa" w:w="100"/>
@@ -13359,7 +13346,7 @@
         </w:tc>
         <w:tc>
           <w:tcPr>
-            <w:tcW w:type="dxa" w:w="2891"/>
+            <w:tcW w:type="dxa" w:w="3580"/>
             <w:tcMar>
               <w:top w:type="dxa" w:w="50"/>
               <w:left w:type="dxa" w:w="100"/>
@@ -13377,25 +13364,7 @@
         </w:tc>
         <w:tc>
           <w:tcPr>
-            <w:tcW w:type="dxa" w:w="2506"/>
-            <w:tcMar>
-              <w:top w:type="dxa" w:w="50"/>
-              <w:left w:type="dxa" w:w="100"/>
-              <w:bottom w:type="dxa" w:w="50"/>
-              <w:right w:type="dxa" w:w="100"/>
-            </w:tcMar>
-            <w:vAlign w:val="center"/>
-          </w:tcPr>
-          <w:p>
-            <w:pPr>
-              <w:spacing w:after="0" w:line="252"/>
-              <w:jc w:val="center"/>
-            </w:pPr>
-          </w:p>
-        </w:tc>
-        <w:tc>
-          <w:tcPr>
-            <w:tcW w:type="dxa" w:w="2506"/>
+            <w:tcW w:type="dxa" w:w="3580"/>
             <w:tcMar>
               <w:top w:type="dxa" w:w="50"/>
               <w:left w:type="dxa" w:w="100"/>
@@ -13419,7 +13388,7 @@
         </w:trPr>
         <w:tc>
           <w:tcPr>
-            <w:tcW w:type="dxa" w:w="1735"/>
+            <w:tcW w:type="dxa" w:w="2478"/>
             <w:tcMar>
               <w:top w:type="dxa" w:w="50"/>
               <w:left w:type="dxa" w:w="100"/>
@@ -13437,7 +13406,7 @@
         </w:tc>
         <w:tc>
           <w:tcPr>
-            <w:tcW w:type="dxa" w:w="2891"/>
+            <w:tcW w:type="dxa" w:w="3580"/>
             <w:tcMar>
               <w:top w:type="dxa" w:w="50"/>
               <w:left w:type="dxa" w:w="100"/>
@@ -13455,25 +13424,7 @@
         </w:tc>
         <w:tc>
           <w:tcPr>
-            <w:tcW w:type="dxa" w:w="2506"/>
-            <w:tcMar>
-              <w:top w:type="dxa" w:w="50"/>
-              <w:left w:type="dxa" w:w="100"/>
-              <w:bottom w:type="dxa" w:w="50"/>
-              <w:right w:type="dxa" w:w="100"/>
-            </w:tcMar>
-            <w:vAlign w:val="center"/>
-          </w:tcPr>
-          <w:p>
-            <w:pPr>
-              <w:spacing w:after="0" w:line="252"/>
-              <w:jc w:val="center"/>
-            </w:pPr>
-          </w:p>
-        </w:tc>
-        <w:tc>
-          <w:tcPr>
-            <w:tcW w:type="dxa" w:w="2506"/>
+            <w:tcW w:type="dxa" w:w="3580"/>
             <w:tcMar>
               <w:top w:type="dxa" w:w="50"/>
               <w:left w:type="dxa" w:w="100"/>
@@ -13497,7 +13448,7 @@
         </w:trPr>
         <w:tc>
           <w:tcPr>
-            <w:tcW w:type="dxa" w:w="1735"/>
+            <w:tcW w:type="dxa" w:w="2478"/>
             <w:tcMar>
               <w:top w:type="dxa" w:w="50"/>
               <w:left w:type="dxa" w:w="100"/>
@@ -13515,7 +13466,7 @@
         </w:tc>
         <w:tc>
           <w:tcPr>
-            <w:tcW w:type="dxa" w:w="2891"/>
+            <w:tcW w:type="dxa" w:w="3580"/>
             <w:tcMar>
               <w:top w:type="dxa" w:w="50"/>
               <w:left w:type="dxa" w:w="100"/>
@@ -13533,25 +13484,7 @@
         </w:tc>
         <w:tc>
           <w:tcPr>
-            <w:tcW w:type="dxa" w:w="2506"/>
-            <w:tcMar>
-              <w:top w:type="dxa" w:w="50"/>
-              <w:left w:type="dxa" w:w="100"/>
-              <w:bottom w:type="dxa" w:w="50"/>
-              <w:right w:type="dxa" w:w="100"/>
-            </w:tcMar>
-            <w:vAlign w:val="center"/>
-          </w:tcPr>
-          <w:p>
-            <w:pPr>
-              <w:spacing w:after="0" w:line="252"/>
-              <w:jc w:val="center"/>
-            </w:pPr>
-          </w:p>
-        </w:tc>
-        <w:tc>
-          <w:tcPr>
-            <w:tcW w:type="dxa" w:w="2506"/>
+            <w:tcW w:type="dxa" w:w="3580"/>
             <w:tcMar>
               <w:top w:type="dxa" w:w="50"/>
               <w:left w:type="dxa" w:w="100"/>
@@ -13575,7 +13508,7 @@
         </w:trPr>
         <w:tc>
           <w:tcPr>
-            <w:tcW w:type="dxa" w:w="1735"/>
+            <w:tcW w:type="dxa" w:w="2478"/>
             <w:tcMar>
               <w:top w:type="dxa" w:w="50"/>
               <w:left w:type="dxa" w:w="100"/>
@@ -13593,7 +13526,7 @@
         </w:tc>
         <w:tc>
           <w:tcPr>
-            <w:tcW w:type="dxa" w:w="2891"/>
+            <w:tcW w:type="dxa" w:w="3580"/>
             <w:tcMar>
               <w:top w:type="dxa" w:w="50"/>
               <w:left w:type="dxa" w:w="100"/>
@@ -13611,25 +13544,7 @@
         </w:tc>
         <w:tc>
           <w:tcPr>
-            <w:tcW w:type="dxa" w:w="2506"/>
-            <w:tcMar>
-              <w:top w:type="dxa" w:w="50"/>
-              <w:left w:type="dxa" w:w="100"/>
-              <w:bottom w:type="dxa" w:w="50"/>
-              <w:right w:type="dxa" w:w="100"/>
-            </w:tcMar>
-            <w:vAlign w:val="center"/>
-          </w:tcPr>
-          <w:p>
-            <w:pPr>
-              <w:spacing w:after="0" w:line="252"/>
-              <w:jc w:val="center"/>
-            </w:pPr>
-          </w:p>
-        </w:tc>
-        <w:tc>
-          <w:tcPr>
-            <w:tcW w:type="dxa" w:w="2506"/>
+            <w:tcW w:type="dxa" w:w="3580"/>
             <w:tcMar>
               <w:top w:type="dxa" w:w="50"/>
               <w:left w:type="dxa" w:w="100"/>
@@ -13653,7 +13568,7 @@
         </w:trPr>
         <w:tc>
           <w:tcPr>
-            <w:tcW w:type="dxa" w:w="1735"/>
+            <w:tcW w:type="dxa" w:w="2478"/>
             <w:tcMar>
               <w:top w:type="dxa" w:w="50"/>
               <w:left w:type="dxa" w:w="100"/>
@@ -13671,7 +13586,7 @@
         </w:tc>
         <w:tc>
           <w:tcPr>
-            <w:tcW w:type="dxa" w:w="2891"/>
+            <w:tcW w:type="dxa" w:w="3580"/>
             <w:tcMar>
               <w:top w:type="dxa" w:w="50"/>
               <w:left w:type="dxa" w:w="100"/>
@@ -13689,25 +13604,7 @@
         </w:tc>
         <w:tc>
           <w:tcPr>
-            <w:tcW w:type="dxa" w:w="2506"/>
-            <w:tcMar>
-              <w:top w:type="dxa" w:w="50"/>
-              <w:left w:type="dxa" w:w="100"/>
-              <w:bottom w:type="dxa" w:w="50"/>
-              <w:right w:type="dxa" w:w="100"/>
-            </w:tcMar>
-            <w:vAlign w:val="center"/>
-          </w:tcPr>
-          <w:p>
-            <w:pPr>
-              <w:spacing w:after="0" w:line="252"/>
-              <w:jc w:val="center"/>
-            </w:pPr>
-          </w:p>
-        </w:tc>
-        <w:tc>
-          <w:tcPr>
-            <w:tcW w:type="dxa" w:w="2506"/>
+            <w:tcW w:type="dxa" w:w="3580"/>
             <w:tcMar>
               <w:top w:type="dxa" w:w="50"/>
               <w:left w:type="dxa" w:w="100"/>
@@ -13731,7 +13628,7 @@
         </w:trPr>
         <w:tc>
           <w:tcPr>
-            <w:tcW w:type="dxa" w:w="1735"/>
+            <w:tcW w:type="dxa" w:w="2478"/>
             <w:tcMar>
               <w:top w:type="dxa" w:w="50"/>
               <w:left w:type="dxa" w:w="100"/>
@@ -13749,7 +13646,7 @@
         </w:tc>
         <w:tc>
           <w:tcPr>
-            <w:tcW w:type="dxa" w:w="2891"/>
+            <w:tcW w:type="dxa" w:w="3580"/>
             <w:tcMar>
               <w:top w:type="dxa" w:w="50"/>
               <w:left w:type="dxa" w:w="100"/>
@@ -13767,25 +13664,7 @@
         </w:tc>
         <w:tc>
           <w:tcPr>
-            <w:tcW w:type="dxa" w:w="2506"/>
-            <w:tcMar>
-              <w:top w:type="dxa" w:w="50"/>
-              <w:left w:type="dxa" w:w="100"/>
-              <w:bottom w:type="dxa" w:w="50"/>
-              <w:right w:type="dxa" w:w="100"/>
-            </w:tcMar>
-            <w:vAlign w:val="center"/>
-          </w:tcPr>
-          <w:p>
-            <w:pPr>
-              <w:spacing w:after="0" w:line="252"/>
-              <w:jc w:val="center"/>
-            </w:pPr>
-          </w:p>
-        </w:tc>
-        <w:tc>
-          <w:tcPr>
-            <w:tcW w:type="dxa" w:w="2506"/>
+            <w:tcW w:type="dxa" w:w="3580"/>
             <w:tcMar>
               <w:top w:type="dxa" w:w="50"/>
               <w:left w:type="dxa" w:w="100"/>
@@ -13809,7 +13688,7 @@
         </w:trPr>
         <w:tc>
           <w:tcPr>
-            <w:tcW w:type="dxa" w:w="1735"/>
+            <w:tcW w:type="dxa" w:w="2478"/>
             <w:tcMar>
               <w:top w:type="dxa" w:w="50"/>
               <w:left w:type="dxa" w:w="100"/>
@@ -13827,7 +13706,7 @@
         </w:tc>
         <w:tc>
           <w:tcPr>
-            <w:tcW w:type="dxa" w:w="2891"/>
+            <w:tcW w:type="dxa" w:w="3580"/>
             <w:tcMar>
               <w:top w:type="dxa" w:w="50"/>
               <w:left w:type="dxa" w:w="100"/>
@@ -13845,25 +13724,7 @@
         </w:tc>
         <w:tc>
           <w:tcPr>
-            <w:tcW w:type="dxa" w:w="2506"/>
-            <w:tcMar>
-              <w:top w:type="dxa" w:w="50"/>
-              <w:left w:type="dxa" w:w="100"/>
-              <w:bottom w:type="dxa" w:w="50"/>
-              <w:right w:type="dxa" w:w="100"/>
-            </w:tcMar>
-            <w:vAlign w:val="center"/>
-          </w:tcPr>
-          <w:p>
-            <w:pPr>
-              <w:spacing w:after="0" w:line="252"/>
-              <w:jc w:val="center"/>
-            </w:pPr>
-          </w:p>
-        </w:tc>
-        <w:tc>
-          <w:tcPr>
-            <w:tcW w:type="dxa" w:w="2506"/>
+            <w:tcW w:type="dxa" w:w="3580"/>
             <w:tcMar>
               <w:top w:type="dxa" w:w="50"/>
               <w:left w:type="dxa" w:w="100"/>
@@ -13887,7 +13748,7 @@
         </w:trPr>
         <w:tc>
           <w:tcPr>
-            <w:tcW w:type="dxa" w:w="1735"/>
+            <w:tcW w:type="dxa" w:w="2478"/>
             <w:tcMar>
               <w:top w:type="dxa" w:w="50"/>
               <w:left w:type="dxa" w:w="100"/>
@@ -13905,7 +13766,7 @@
         </w:tc>
         <w:tc>
           <w:tcPr>
-            <w:tcW w:type="dxa" w:w="2891"/>
+            <w:tcW w:type="dxa" w:w="3580"/>
             <w:tcMar>
               <w:top w:type="dxa" w:w="50"/>
               <w:left w:type="dxa" w:w="100"/>
@@ -13923,25 +13784,7 @@
         </w:tc>
         <w:tc>
           <w:tcPr>
-            <w:tcW w:type="dxa" w:w="2506"/>
-            <w:tcMar>
-              <w:top w:type="dxa" w:w="50"/>
-              <w:left w:type="dxa" w:w="100"/>
-              <w:bottom w:type="dxa" w:w="50"/>
-              <w:right w:type="dxa" w:w="100"/>
-            </w:tcMar>
-            <w:vAlign w:val="center"/>
-          </w:tcPr>
-          <w:p>
-            <w:pPr>
-              <w:spacing w:after="0" w:line="252"/>
-              <w:jc w:val="center"/>
-            </w:pPr>
-          </w:p>
-        </w:tc>
-        <w:tc>
-          <w:tcPr>
-            <w:tcW w:type="dxa" w:w="2506"/>
+            <w:tcW w:type="dxa" w:w="3580"/>
             <w:tcMar>
               <w:top w:type="dxa" w:w="50"/>
               <w:left w:type="dxa" w:w="100"/>
@@ -13965,7 +13808,7 @@
         </w:trPr>
         <w:tc>
           <w:tcPr>
-            <w:tcW w:type="dxa" w:w="1735"/>
+            <w:tcW w:type="dxa" w:w="2478"/>
             <w:tcMar>
               <w:top w:type="dxa" w:w="50"/>
               <w:left w:type="dxa" w:w="100"/>
@@ -13983,7 +13826,7 @@
         </w:tc>
         <w:tc>
           <w:tcPr>
-            <w:tcW w:type="dxa" w:w="2891"/>
+            <w:tcW w:type="dxa" w:w="3580"/>
             <w:tcMar>
               <w:top w:type="dxa" w:w="50"/>
               <w:left w:type="dxa" w:w="100"/>
@@ -14001,25 +13844,7 @@
         </w:tc>
         <w:tc>
           <w:tcPr>
-            <w:tcW w:type="dxa" w:w="2506"/>
-            <w:tcMar>
-              <w:top w:type="dxa" w:w="50"/>
-              <w:left w:type="dxa" w:w="100"/>
-              <w:bottom w:type="dxa" w:w="50"/>
-              <w:right w:type="dxa" w:w="100"/>
-            </w:tcMar>
-            <w:vAlign w:val="center"/>
-          </w:tcPr>
-          <w:p>
-            <w:pPr>
-              <w:spacing w:after="0" w:line="252"/>
-              <w:jc w:val="center"/>
-            </w:pPr>
-          </w:p>
-        </w:tc>
-        <w:tc>
-          <w:tcPr>
-            <w:tcW w:type="dxa" w:w="2506"/>
+            <w:tcW w:type="dxa" w:w="3580"/>
             <w:tcMar>
               <w:top w:type="dxa" w:w="50"/>
               <w:left w:type="dxa" w:w="100"/>
@@ -14043,7 +13868,7 @@
         </w:trPr>
         <w:tc>
           <w:tcPr>
-            <w:tcW w:type="dxa" w:w="1735"/>
+            <w:tcW w:type="dxa" w:w="2478"/>
             <w:tcMar>
               <w:top w:type="dxa" w:w="50"/>
               <w:left w:type="dxa" w:w="100"/>
@@ -14061,7 +13886,7 @@
         </w:tc>
         <w:tc>
           <w:tcPr>
-            <w:tcW w:type="dxa" w:w="2891"/>
+            <w:tcW w:type="dxa" w:w="3580"/>
             <w:tcMar>
               <w:top w:type="dxa" w:w="50"/>
               <w:left w:type="dxa" w:w="100"/>
@@ -14079,25 +13904,7 @@
         </w:tc>
         <w:tc>
           <w:tcPr>
-            <w:tcW w:type="dxa" w:w="2506"/>
-            <w:tcMar>
-              <w:top w:type="dxa" w:w="50"/>
-              <w:left w:type="dxa" w:w="100"/>
-              <w:bottom w:type="dxa" w:w="50"/>
-              <w:right w:type="dxa" w:w="100"/>
-            </w:tcMar>
-            <w:vAlign w:val="center"/>
-          </w:tcPr>
-          <w:p>
-            <w:pPr>
-              <w:spacing w:after="0" w:line="252"/>
-              <w:jc w:val="center"/>
-            </w:pPr>
-          </w:p>
-        </w:tc>
-        <w:tc>
-          <w:tcPr>
-            <w:tcW w:type="dxa" w:w="2506"/>
+            <w:tcW w:type="dxa" w:w="3580"/>
             <w:tcMar>
               <w:top w:type="dxa" w:w="50"/>
               <w:left w:type="dxa" w:w="100"/>

</xml_diff>

<commit_message>
Welt 0: Tracetabellen nur mit Variablen, Codestellen markiert
Portal (Infoteil 3, Aufgabe 5 + LSG), AB 2–4, Folie 9, Warm-up W0-12/W0-19, Lab-Aufgaben und Boss:
Bedingungsspalten entfernt, „// → Tabellenzeile“ an den Eintragsstellen.

Co-Authored-By: Claude Opus 5.5 <noreply@anthropic.com>
Claude-Session: https://claude.ai/code/session_01CemoEYGRdCe5FszEBVFFUP
</commit_message>
<xml_diff>
--- a/materialien/Welt0_Akademie/2_Arbeitsblaetter/AQ_W0_AB2_Werkstatt_Basics.docx
+++ b/materialien/Welt0_Akademie/2_Arbeitsblaetter/AQ_W0_AB2_Werkstatt_Basics.docx
@@ -8213,6 +8213,15 @@
               </w:rPr>
               <w:t xml:space="preserve">int betrag = 487;</w:t>
             </w:r>
+            <w:r>
+              <w:rPr>
+                <w:rFonts w:ascii="Consolas" w:cs="Consolas" w:eastAsia="Consolas" w:hAnsi="Consolas"/>
+                <w:color w:val="5F7F5F"/>
+                <w:sz w:val="18"/>
+                <w:szCs w:val="18"/>
+              </w:rPr>
+              <w:t xml:space="preserve">   // → Tabellenzeile</w:t>
+            </w:r>
           </w:p>
           <w:p>
             <w:pPr>
@@ -8238,6 +8247,15 @@
               </w:rPr>
               <w:t xml:space="preserve">int gold = betrag / 100;</w:t>
             </w:r>
+            <w:r>
+              <w:rPr>
+                <w:rFonts w:ascii="Consolas" w:cs="Consolas" w:eastAsia="Consolas" w:hAnsi="Consolas"/>
+                <w:color w:val="5F7F5F"/>
+                <w:sz w:val="18"/>
+                <w:szCs w:val="18"/>
+              </w:rPr>
+              <w:t xml:space="preserve">   // → Tabellenzeile</w:t>
+            </w:r>
           </w:p>
           <w:p>
             <w:pPr>
@@ -8263,6 +8281,15 @@
               </w:rPr>
               <w:t xml:space="preserve">betrag = betrag % 100;</w:t>
             </w:r>
+            <w:r>
+              <w:rPr>
+                <w:rFonts w:ascii="Consolas" w:cs="Consolas" w:eastAsia="Consolas" w:hAnsi="Consolas"/>
+                <w:color w:val="5F7F5F"/>
+                <w:sz w:val="18"/>
+                <w:szCs w:val="18"/>
+              </w:rPr>
+              <w:t xml:space="preserve">   // → Tabellenzeile</w:t>
+            </w:r>
           </w:p>
           <w:p>
             <w:pPr>
@@ -8288,6 +8315,15 @@
               </w:rPr>
               <w:t xml:space="preserve">int silber = betrag / 10;</w:t>
             </w:r>
+            <w:r>
+              <w:rPr>
+                <w:rFonts w:ascii="Consolas" w:cs="Consolas" w:eastAsia="Consolas" w:hAnsi="Consolas"/>
+                <w:color w:val="5F7F5F"/>
+                <w:sz w:val="18"/>
+                <w:szCs w:val="18"/>
+              </w:rPr>
+              <w:t xml:space="preserve">   // → Tabellenzeile</w:t>
+            </w:r>
           </w:p>
           <w:p>
             <w:pPr>
@@ -8312,6 +8348,15 @@
                 <w:szCs w:val="18"/>
               </w:rPr>
               <w:t xml:space="preserve">int kupfer = betrag % 10;</w:t>
+            </w:r>
+            <w:r>
+              <w:rPr>
+                <w:rFonts w:ascii="Consolas" w:cs="Consolas" w:eastAsia="Consolas" w:hAnsi="Consolas"/>
+                <w:color w:val="5F7F5F"/>
+                <w:sz w:val="18"/>
+                <w:szCs w:val="18"/>
+              </w:rPr>
+              <w:t xml:space="preserve">   // → Tabellenzeile</w:t>
             </w:r>
           </w:p>
         </w:tc>
@@ -8393,7 +8438,7 @@
                 <w:sz w:val="22"/>
                 <w:szCs w:val="22"/>
               </w:rPr>
-              <w:t xml:space="preserve">Erstelle eine Tracetabelle: eine Zeile pro Anweisung, eingetragen wird nur der neue Wert.</w:t>
+              <w:t xml:space="preserve">Erstelle eine Tracetabelle: eine Zeile an jeder mit „// → Tabellenzeile“ markierten Stelle (hier: nach jeder Anweisung), eingetragen wird nur der neue Wert.</w:t>
             </w:r>
           </w:p>
         </w:tc>

</xml_diff>